<commit_message>
feat: generate-torture-docx.ts に de-bold-reorder 段落（"Der Vertrag wurde gestern unterzeichnet." の3ラン）と probe を追加
</commit_message>
<xml_diff>
--- a/fixtures/docx/work-doc-torture.docx
+++ b/fixtures/docx/work-doc-torture.docx
@@ -131,6 +131,27 @@
         <w:t xml:space="preserve"> now.</w:t>
       </w:r>
     </w:p>
+    <w:p>
+      <w:r>
+        <w:rPr>
+          <w:lang w:val="de-DE"/>
+        </w:rPr>
+        <w:t xml:space="preserve">Der Vertrag wurde </w:t>
+      </w:r>
+      <w:r>
+        <w:rPr>
+          <w:b/>
+          <w:lang w:val="de-DE"/>
+        </w:rPr>
+        <w:t>gestern</w:t>
+      </w:r>
+      <w:r>
+        <w:rPr>
+          <w:lang w:val="de-DE"/>
+        </w:rPr>
+        <w:t xml:space="preserve"> unterzeichnet.</w:t>
+      </w:r>
+    </w:p>
     <w:sectPr>
       <w:pgSz w:w="11906" w:h="16838"/>
       <w:pgMar w:top="1417" w:right="1417" w:bottom="1417" w:left="1417"/>

</xml_diff>